<commit_message>
Fixing the new old code after clarifications
</commit_message>
<xml_diff>
--- a/docs/CODE_DOCUMENTATION.docx
+++ b/docs/CODE_DOCUMENTATION.docx
@@ -134,11 +134,9 @@
     </w:p>
     <w:p>
       <w:r>
-        <w:t>9</w:t>
-      </w:r>
-      <w:r>
-        <w:t>. The 13 Behavioral Patterns</w:t>
-      </w:r>
+        <w:t>9. The 14 Behavioral Patterns</w:t>
+      </w:r>
+      <w:r/>
     </w:p>
     <w:p>
       <w:r>
@@ -3875,7 +3873,7 @@
               <w:cnfStyle w:val="000000100000" w:firstRow="0" w:lastRow="0" w:firstColumn="0" w:lastColumn="0" w:oddVBand="0" w:evenVBand="0" w:oddHBand="1" w:evenHBand="0" w:firstRowFirstColumn="0" w:firstRowLastColumn="0" w:lastRowFirstColumn="0" w:lastRowLastColumn="0"/>
             </w:pPr>
             <w:r>
-              <w:t>trusted | unverified_ownership | orphan</w:t>
+              <w:t>trusted | unverified_ownership | content_mismatch | orphan</w:t>
             </w:r>
           </w:p>
         </w:tc>
@@ -6683,7 +6681,7 @@
         <w:pStyle w:val="ListBullet"/>
       </w:pPr>
       <w:r>
-        <w:t>RISK_LEVELS / TARGET_COVERAGE: the two constants fixed by design (score bands, 80% goal) — everything else is derived from data, never hardcoded.</w:t>
+        <w:t>RISK_LEVELS / TARGET_COVERAGE / FAILING_SCORE_THRESHOLD: constants fixed by design (score bands, 80% goal, the 60/100 failing-score line) — everything else is derived from data, never hardcoded.</w:t>
       </w:r>
     </w:p>
     <w:p>
@@ -6988,6 +6986,14 @@
         <w:t>Facilitator/student ownership mismatches (a note's facilitator_email not matching the student's assigned facilitator) are retained but marked unverified_ownership — excluded from parent communication and numeric risk contribution until trusted, never dropped.</w:t>
       </w:r>
     </w:p>
+    <w:p>
+      <w:pPr>
+        <w:pStyle w:val="ListBullet"/>
+      </w:pPr>
+      <w:r>
+        <w:t>Note content-vs-student mismatches (the note's Arabic text names a different roster student's first name than the one it's filed under, via config.py's ARABIC_NAME_VARIANTS lookup) are retained but marked content_mismatch — same treatment as unverified_ownership, since either the student_id or the note text could be the one that's wrong.</w:t>
+      </w:r>
+    </w:p>
     <w:p/>
     <w:p>
       <w:pPr>
@@ -7171,7 +7177,7 @@
     </w:p>
     <w:p>
       <w:r>
-        <w:t>Purpose: 13 named, threshold-based detectors — deliberately zero LLM involvement, because behavior-change detection needs to be auditable and unit-testable (see tests/test_patterns.py), not something a model could quietly reinterpret.</w:t>
+        <w:t>Purpose: 14 named, threshold-based detectors — deliberately zero LLM involvement, because behavior-change detection needs to be auditable and unit-testable (see tests/test_patterns.py), not something a model could quietly reinterpret.</w:t>
       </w:r>
     </w:p>
     <w:p>
@@ -8063,14 +8069,12 @@
         <w:rPr>
           <w:color w:val="2A78D6"/>
         </w:rPr>
-        <w:lastRenderedPageBreak/>
-        <w:t>9</w:t>
+        <w:t>9. The 14 Behavioral Patterns</w:t>
       </w:r>
       <w:r>
         <w:rPr>
           <w:color w:val="2A78D6"/>
         </w:rPr>
-        <w:t>. The 13 Behavioral Patterns</w:t>
       </w:r>
     </w:p>
     <w:tbl>
@@ -8358,6 +8362,28 @@
             </w:pPr>
             <w:r>
               <w:t>recent attendance &gt;= 60 and practice &gt;= 10, both within a tight trend band</w:t>
+            </w:r>
+          </w:p>
+        </w:tc>
+      </w:tr>
+      <w:tr>
+        <w:tc>
+          <w:tcPr>
+            <w:tcW w:type="dxa" w:w="3528"/>
+          </w:tcPr>
+          <w:p>
+            <w:r>
+              <w:t>FAILING_QUIZ_SCORE</w:t>
+            </w:r>
+          </w:p>
+        </w:tc>
+        <w:tc>
+          <w:tcPr>
+            <w:tcW w:type="dxa" w:w="5328"/>
+          </w:tcPr>
+          <w:p>
+            <w:r>
+              <w:t>quiz1_score &lt; 60/100 (absolute floor, independent of target_score)</w:t>
             </w:r>
           </w:p>
         </w:tc>

</xml_diff>